<commit_message>
adding director disclouser changes
</commit_message>
<xml_diff>
--- a/Backend/Director_Disclosure/Output_Disclosures/2024-25/AAJKAL_INVESTMENTS_PRIVATE_LIMITED/DIR-8/DIR8_MUKESH_MAHENDRABHAI_SHAH_00084402.docx
+++ b/Backend/Director_Disclosure/Output_Disclosures/2024-25/AAJKAL_INVESTMENTS_PRIVATE_LIMITED/DIR-8/DIR8_MUKESH_MAHENDRABHAI_SHAH_00084402.docx
@@ -550,7 +550,7 @@
                 <w:b w:val="0"/>
                 <w:sz w:val="23"/>
               </w:rPr>
-              <w:t>SURAJKIRAN SOLAR TECHNOLOGIES LIMITED</w:t>
+              <w:t>ADANI SOLAR ENERGY KUTCHH ONE LIMITED</w:t>
             </w:r>
           </w:p>
         </w:tc>
@@ -620,146 +620,6 @@
                 <w:b w:val="0"/>
                 <w:sz w:val="23"/>
               </w:rPr>
-              <w:t>ADANI SOLAR ENERGY KUTCHH ONE LIMITED</w:t>
-            </w:r>
-          </w:p>
-        </w:tc>
-        <w:tc>
-          <w:tcPr>
-            <w:tcW w:type="dxa" w:w="2610"/>
-          </w:tcPr>
-          <w:p>
-            <w:pPr>
-              <w:spacing w:after="0"/>
-              <w:jc w:val="center"/>
-            </w:pPr>
-            <w:r>
-              <w:rPr>
-                <w:rFonts w:ascii="Adani" w:hAnsi="Adani" w:eastAsia="Adani" w:cs="Adani"/>
-                <w:b w:val="0"/>
-                <w:sz w:val="23"/>
-              </w:rPr>
-              <w:t>10/03/2022</w:t>
-            </w:r>
-          </w:p>
-        </w:tc>
-        <w:tc>
-          <w:tcPr>
-            <w:tcW w:type="dxa" w:w="2250"/>
-          </w:tcPr>
-          <w:p>
-            <w:pPr>
-              <w:spacing w:after="0"/>
-              <w:jc w:val="center"/>
-            </w:pPr>
-          </w:p>
-        </w:tc>
-      </w:tr>
-      <w:tr>
-        <w:tc>
-          <w:tcPr>
-            <w:tcW w:type="dxa" w:w="636"/>
-          </w:tcPr>
-          <w:p>
-            <w:pPr>
-              <w:spacing w:after="0"/>
-              <w:ind w:left="360"/>
-            </w:pPr>
-            <w:r>
-              <w:rPr>
-                <w:rFonts w:ascii="Adani" w:hAnsi="Adani" w:eastAsia="Adani" w:cs="Adani"/>
-                <w:b w:val="0"/>
-                <w:sz w:val="23"/>
-              </w:rPr>
-              <w:t>6</w:t>
-            </w:r>
-          </w:p>
-        </w:tc>
-        <w:tc>
-          <w:tcPr>
-            <w:tcW w:type="dxa" w:w="3864"/>
-          </w:tcPr>
-          <w:p>
-            <w:pPr>
-              <w:spacing w:after="0"/>
-              <w:jc w:val="both"/>
-            </w:pPr>
-            <w:r>
-              <w:rPr>
-                <w:rFonts w:ascii="Adani" w:hAnsi="Adani" w:eastAsia="Adani" w:cs="Adani"/>
-                <w:b w:val="0"/>
-                <w:sz w:val="23"/>
-              </w:rPr>
-              <w:t>ADANI POWER RAJASTHAN LIMITED</w:t>
-            </w:r>
-          </w:p>
-        </w:tc>
-        <w:tc>
-          <w:tcPr>
-            <w:tcW w:type="dxa" w:w="2610"/>
-          </w:tcPr>
-          <w:p>
-            <w:pPr>
-              <w:spacing w:after="0"/>
-              <w:jc w:val="center"/>
-            </w:pPr>
-            <w:r>
-              <w:rPr>
-                <w:rFonts w:ascii="Adani" w:hAnsi="Adani" w:eastAsia="Adani" w:cs="Adani"/>
-                <w:b w:val="0"/>
-                <w:sz w:val="23"/>
-              </w:rPr>
-              <w:t>21/06/2019</w:t>
-            </w:r>
-          </w:p>
-        </w:tc>
-        <w:tc>
-          <w:tcPr>
-            <w:tcW w:type="dxa" w:w="2250"/>
-          </w:tcPr>
-          <w:p>
-            <w:pPr>
-              <w:spacing w:after="0"/>
-              <w:jc w:val="center"/>
-            </w:pPr>
-          </w:p>
-        </w:tc>
-      </w:tr>
-      <w:tr>
-        <w:tc>
-          <w:tcPr>
-            <w:tcW w:type="dxa" w:w="636"/>
-          </w:tcPr>
-          <w:p>
-            <w:pPr>
-              <w:spacing w:after="0"/>
-              <w:ind w:left="360"/>
-            </w:pPr>
-            <w:r>
-              <w:rPr>
-                <w:rFonts w:ascii="Adani" w:hAnsi="Adani" w:eastAsia="Adani" w:cs="Adani"/>
-                <w:b w:val="0"/>
-                <w:sz w:val="23"/>
-              </w:rPr>
-              <w:t>7</w:t>
-            </w:r>
-          </w:p>
-        </w:tc>
-        <w:tc>
-          <w:tcPr>
-            <w:tcW w:type="dxa" w:w="3864"/>
-          </w:tcPr>
-          <w:p>
-            <w:pPr>
-              <w:spacing w:after="0"/>
-              <w:jc w:val="both"/>
-            </w:pPr>
-            <w:r>
-              <w:rPr>
-                <w:rFonts w:ascii="Adani" w:hAnsi="Adani" w:eastAsia="Adani" w:cs="Adani"/>
-                <w:b w:val="0"/>
-                <w:sz w:val="23"/>
-              </w:rPr>
               <w:t>INSPIRON ENGINEERING PRIVATE LIMITED</w:t>
             </w:r>
           </w:p>
@@ -811,7 +671,7 @@
                 <w:b w:val="0"/>
                 <w:sz w:val="23"/>
               </w:rPr>
-              <w:t>8</w:t>
+              <w:t>6</w:t>
             </w:r>
           </w:p>
         </w:tc>
@@ -881,77 +741,7 @@
                 <w:b w:val="0"/>
                 <w:sz w:val="23"/>
               </w:rPr>
-              <w:t>9</w:t>
-            </w:r>
-          </w:p>
-        </w:tc>
-        <w:tc>
-          <w:tcPr>
-            <w:tcW w:type="dxa" w:w="3864"/>
-          </w:tcPr>
-          <w:p>
-            <w:pPr>
-              <w:spacing w:after="0"/>
-              <w:jc w:val="both"/>
-            </w:pPr>
-            <w:r>
-              <w:rPr>
-                <w:rFonts w:ascii="Adani" w:hAnsi="Adani" w:eastAsia="Adani" w:cs="Adani"/>
-                <w:b w:val="0"/>
-                <w:sz w:val="23"/>
-              </w:rPr>
-              <w:t>ADANI POWER MAHARASHTRA LIMITED</w:t>
-            </w:r>
-          </w:p>
-        </w:tc>
-        <w:tc>
-          <w:tcPr>
-            <w:tcW w:type="dxa" w:w="2610"/>
-          </w:tcPr>
-          <w:p>
-            <w:pPr>
-              <w:spacing w:after="0"/>
-              <w:jc w:val="center"/>
-            </w:pPr>
-            <w:r>
-              <w:rPr>
-                <w:rFonts w:ascii="Adani" w:hAnsi="Adani" w:eastAsia="Adani" w:cs="Adani"/>
-                <w:b w:val="0"/>
-                <w:sz w:val="23"/>
-              </w:rPr>
-              <w:t>31/03/2018</w:t>
-            </w:r>
-          </w:p>
-        </w:tc>
-        <w:tc>
-          <w:tcPr>
-            <w:tcW w:type="dxa" w:w="2250"/>
-          </w:tcPr>
-          <w:p>
-            <w:pPr>
-              <w:spacing w:after="0"/>
-              <w:jc w:val="center"/>
-            </w:pPr>
-          </w:p>
-        </w:tc>
-      </w:tr>
-      <w:tr>
-        <w:tc>
-          <w:tcPr>
-            <w:tcW w:type="dxa" w:w="636"/>
-          </w:tcPr>
-          <w:p>
-            <w:pPr>
-              <w:spacing w:after="0"/>
-              <w:ind w:left="360"/>
-            </w:pPr>
-            <w:r>
-              <w:rPr>
-                <w:rFonts w:ascii="Adani" w:hAnsi="Adani" w:eastAsia="Adani" w:cs="Adani"/>
-                <w:b w:val="0"/>
-                <w:sz w:val="23"/>
-              </w:rPr>
-              <w:t>10</w:t>
+              <w:t>7</w:t>
             </w:r>
           </w:p>
         </w:tc>
@@ -1021,77 +811,7 @@
                 <w:b w:val="0"/>
                 <w:sz w:val="23"/>
               </w:rPr>
-              <w:t>11</w:t>
-            </w:r>
-          </w:p>
-        </w:tc>
-        <w:tc>
-          <w:tcPr>
-            <w:tcW w:type="dxa" w:w="3864"/>
-          </w:tcPr>
-          <w:p>
-            <w:pPr>
-              <w:spacing w:after="0"/>
-              <w:jc w:val="both"/>
-            </w:pPr>
-            <w:r>
-              <w:rPr>
-                <w:rFonts w:ascii="Adani" w:hAnsi="Adani" w:eastAsia="Adani" w:cs="Adani"/>
-                <w:b w:val="0"/>
-                <w:sz w:val="23"/>
-              </w:rPr>
-              <w:t>VINPACK AGRO PRIVATE LIMITED</w:t>
-            </w:r>
-          </w:p>
-        </w:tc>
-        <w:tc>
-          <w:tcPr>
-            <w:tcW w:type="dxa" w:w="2610"/>
-          </w:tcPr>
-          <w:p>
-            <w:pPr>
-              <w:spacing w:after="0"/>
-              <w:jc w:val="center"/>
-            </w:pPr>
-            <w:r>
-              <w:rPr>
-                <w:rFonts w:ascii="Adani" w:hAnsi="Adani" w:eastAsia="Adani" w:cs="Adani"/>
-                <w:b w:val="0"/>
-                <w:sz w:val="23"/>
-              </w:rPr>
-              <w:t>10/12/1998</w:t>
-            </w:r>
-          </w:p>
-        </w:tc>
-        <w:tc>
-          <w:tcPr>
-            <w:tcW w:type="dxa" w:w="2250"/>
-          </w:tcPr>
-          <w:p>
-            <w:pPr>
-              <w:spacing w:after="0"/>
-              <w:jc w:val="center"/>
-            </w:pPr>
-          </w:p>
-        </w:tc>
-      </w:tr>
-      <w:tr>
-        <w:tc>
-          <w:tcPr>
-            <w:tcW w:type="dxa" w:w="636"/>
-          </w:tcPr>
-          <w:p>
-            <w:pPr>
-              <w:spacing w:after="0"/>
-              <w:ind w:left="360"/>
-            </w:pPr>
-            <w:r>
-              <w:rPr>
-                <w:rFonts w:ascii="Adani" w:hAnsi="Adani" w:eastAsia="Adani" w:cs="Adani"/>
-                <w:b w:val="0"/>
-                <w:sz w:val="23"/>
-              </w:rPr>
-              <w:t>12</w:t>
+              <w:t>8</w:t>
             </w:r>
           </w:p>
         </w:tc>
@@ -1161,7 +881,7 @@
                 <w:b w:val="0"/>
                 <w:sz w:val="23"/>
               </w:rPr>
-              <w:t>13</w:t>
+              <w:t>9</w:t>
             </w:r>
           </w:p>
         </w:tc>
@@ -1315,7 +1035,7 @@
           <w:b w:val="0"/>
           <w:sz w:val="23"/>
         </w:rPr>
-        <w:t xml:space="preserve">Date: 27th May, 2026</w:t>
+        <w:t xml:space="preserve">Date: 08th June, 2026</w:t>
         <w:tab/>
       </w:r>
     </w:p>

</xml_diff>